<commit_message>
feat(renderer): harden BM-001 shadow renderer readiness
Co-authored-by: Cursor <cursoragent@cursor.com>
</commit_message>
<xml_diff>
--- a/apps/api/storage/templates/normalized-docx/BM-001/BM-001_normalized.docx
+++ b/apps/api/storage/templates/normalized-docx/BM-001/BM-001_normalized.docx
@@ -1761,8 +1761,10 @@
   <w:docDefaults>
     <w:rPrDefault>
       <w:rPr>
-        <w:rFonts w:ascii="Times New Roman" w:eastAsia="SimSun" w:hAnsi="Times New Roman" w:cs="Times New Roman"/>
+        <w:rFonts w:ascii="Times New Roman" w:eastAsia="Times New Roman" w:hAnsi="Times New Roman" w:cs="Times New Roman"/>
         <w:lang w:val="en-US" w:eastAsia="en-US" w:bidi="ar-SA"/>
+        <w:sz w:val="26"/>
+        <w:szCs w:val="26"/>
       </w:rPr>
     </w:rPrDefault>
     <w:pPrDefault/>
@@ -2071,9 +2073,9 @@
       <w:suppressAutoHyphens/>
     </w:pPr>
     <w:rPr>
-      <w:rFonts w:ascii=".VnTime;Times New Roman" w:eastAsia="Calibri" w:hAnsi=".VnTime;Times New Roman" w:cs=".VnTime;Times New Roman"/>
-      <w:sz w:val="28"/>
-      <w:szCs w:val="24"/>
+      <w:rFonts w:ascii="Times New Roman" w:eastAsia="Times New Roman" w:hAnsi="Times New Roman" w:cs="Times New Roman"/>
+      <w:sz w:val="26"/>
+      <w:szCs w:val="26"/>
       <w:lang w:eastAsia="zh-CN"/>
     </w:rPr>
   </w:style>

</xml_diff>

<commit_message>
fix(renderer): remediate BM-001 print formatting
</commit_message>
<xml_diff>
--- a/apps/api/storage/templates/normalized-docx/BM-001/BM-001_normalized.docx
+++ b/apps/api/storage/templates/normalized-docx/BM-001/BM-001_normalized.docx
@@ -37,6 +37,7 @@
                       <w:b/>
                       <w:sz w:val="16"/>
                       <w:szCs w:val="16"/>
+                      <w:color w:val="000000"/>
                     </w:rPr>
                     <w:t>Mẫu số 01/HS</w:t>
                   </w:r>
@@ -56,6 +57,7 @@
                       <w:spacing w:val="-4"/>
                       <w:sz w:val="16"/>
                       <w:szCs w:val="16"/>
+                      <w:color w:val="000000"/>
                     </w:rPr>
                     <w:t>(Ban hành theo Thông tư  số</w:t>
                   </w:r>
@@ -67,6 +69,7 @@
                       <w:sz w:val="16"/>
                       <w:szCs w:val="16"/>
                       <w:lang w:val="vi-VN"/>
+                      <w:color w:val="000000"/>
                     </w:rPr>
                     <w:t xml:space="preserve"> 03</w:t>
                   </w:r>
@@ -77,6 +80,7 @@
                       <w:spacing w:val="-4"/>
                       <w:sz w:val="16"/>
                       <w:szCs w:val="16"/>
+                      <w:color w:val="000000"/>
                     </w:rPr>
                     <w:t xml:space="preserve">/2026/TT-VKSTC </w:t>
                   </w:r>
@@ -96,6 +100,7 @@
                       <w:spacing w:val="-4"/>
                       <w:sz w:val="16"/>
                       <w:szCs w:val="16"/>
+                      <w:color w:val="000000"/>
                     </w:rPr>
                     <w:t>Ngày</w:t>
                   </w:r>
@@ -107,6 +112,7 @@
                       <w:sz w:val="16"/>
                       <w:szCs w:val="16"/>
                       <w:lang w:val="vi-VN"/>
+                      <w:color w:val="000000"/>
                     </w:rPr>
                     <w:t xml:space="preserve"> 09</w:t>
                   </w:r>
@@ -117,6 +123,7 @@
                       <w:spacing w:val="-4"/>
                       <w:sz w:val="16"/>
                       <w:szCs w:val="16"/>
+                      <w:color w:val="000000"/>
                     </w:rPr>
                     <w:t>/</w:t>
                   </w:r>
@@ -128,6 +135,7 @@
                       <w:sz w:val="16"/>
                       <w:szCs w:val="16"/>
                       <w:lang w:val="vi-VN"/>
+                      <w:color w:val="000000"/>
                     </w:rPr>
                     <w:t>02</w:t>
                   </w:r>
@@ -138,6 +146,7 @@
                       <w:spacing w:val="-4"/>
                       <w:sz w:val="16"/>
                       <w:szCs w:val="16"/>
+                      <w:color w:val="000000"/>
                     </w:rPr>
                     <w:t>/2026)</w:t>
                   </w:r>
@@ -146,6 +155,7 @@
                       <w:rFonts w:ascii="Times New Roman" w:hAnsi="Times New Roman" w:cs="Times New Roman"/>
                       <w:sz w:val="16"/>
                       <w:szCs w:val="16"/>
+                      <w:color w:val="000000"/>
                     </w:rPr>
                     <w:t xml:space="preserve"> </w:t>
                   </w:r>
@@ -465,7 +475,7 @@
       <w:r>
         <w:rPr>
           <w:rFonts w:ascii="Times New Roman" w:hAnsi="Times New Roman" w:cs="Times New Roman"/>
-          <w:color w:val="FF0000"/>
+          <w:color w:val="000000"/>
           <w:szCs w:val="28"/>
         </w:rPr>
         <w:t>Tôi</w:t>
@@ -473,7 +483,7 @@
       <w:r>
         <w:rPr>
           <w:rFonts w:ascii="Times New Roman" w:hAnsi="Times New Roman" w:cs="Times New Roman"/>
-          <w:color w:val="FF0000"/>
+          <w:color w:val="000000"/>
           <w:szCs w:val="28"/>
           <w:lang w:val="vi-VN"/>
         </w:rPr>
@@ -482,7 +492,7 @@
       <w:r>
         <w:rPr>
           <w:rFonts w:ascii="Times New Roman" w:eastAsia="SimSun" w:hAnsi="Times New Roman" w:cs="Times New Roman"/>
-          <w:color w:val="FF0000"/>
+          <w:color w:val="000000"/>
           <w:szCs w:val="28"/>
         </w:rPr>
         <w:t>{{receiver.fullName}}</w:t>
@@ -490,7 +500,7 @@
       <w:r>
         <w:rPr>
           <w:rFonts w:ascii="Times New Roman" w:hAnsi="Times New Roman" w:cs="Times New Roman"/>
-          <w:color w:val="FF0000"/>
+          <w:color w:val="000000"/>
           <w:szCs w:val="28"/>
         </w:rPr>
         <w:t>;</w:t>
@@ -515,6 +525,7 @@
         <w:rPr>
           <w:rFonts w:ascii="Times New Roman" w:hAnsi="Times New Roman" w:cs="Times New Roman"/>
           <w:szCs w:val="28"/>
+          <w:color w:val="000000"/>
         </w:rPr>
         <w:t>chức danh:</w:t>
       </w:r>
@@ -523,6 +534,7 @@
           <w:rFonts w:ascii="Times New Roman" w:hAnsi="Times New Roman" w:cs="Times New Roman"/>
           <w:szCs w:val="28"/>
           <w:lang w:val="vi-VN"/>
+          <w:color w:val="000000"/>
         </w:rPr>
         <w:t xml:space="preserve"> </w:t>
       </w:r>
@@ -530,6 +542,7 @@
         <w:rPr>
           <w:rFonts w:ascii="Times New Roman" w:eastAsia="SimSun" w:hAnsi="Times New Roman" w:cs="Times New Roman"/>
           <w:szCs w:val="28"/>
+          <w:color w:val="000000"/>
         </w:rPr>
         <w:t>{{receiver.positionTitle}}</w:t>
       </w:r>

</xml_diff>